<commit_message>
docs: embed available screenshot into rewritten report
Agent-Logs-Url: https://github.com/zjxyun/network/sessions/148d41f2-cb6f-4b10-b29e-49be0e593b9f

Co-authored-by: zjxyun <153380537+zjxyun@users.noreply.github.com>
</commit_message>
<xml_diff>
--- a/实验4扩展--基于OpenSSL的PKI证书体系搭建与通信加密实现课程设计报告（重写版）.docx
+++ b/实验4扩展--基于OpenSSL的PKI证书体系搭建与通信加密实现课程设计报告（重写版）.docx
@@ -608,6 +608,42 @@
         <w:t>touch demoCA/index.txt</w:t>
         <w:br/>
         <w:t>echo 01 &gt; demoCA/serial</w:t>
+      </w:r>
+    </w:p>
+    <w:p>
+      <w:r>
+        <w:drawing>
+          <wp:inline xmlns:a="http://schemas.openxmlformats.org/drawingml/2006/main" xmlns:pic="http://schemas.openxmlformats.org/drawingml/2006/picture">
+            <wp:extent cx="5220000" cy="1213724"/>
+            <wp:docPr id="1" name="Picture 1"/>
+            <wp:cNvGraphicFramePr>
+              <a:graphicFrameLocks noChangeAspect="1"/>
+            </wp:cNvGraphicFramePr>
+            <a:graphic>
+              <a:graphicData uri="http://schemas.openxmlformats.org/drawingml/2006/picture">
+                <pic:pic>
+                  <pic:nvPicPr>
+                    <pic:cNvPr id="0" name="network_report_image1.png"/>
+                    <pic:cNvPicPr/>
+                  </pic:nvPicPr>
+                  <pic:blipFill>
+                    <a:blip r:embed="rId9"/>
+                    <a:stretch>
+                      <a:fillRect/>
+                    </a:stretch>
+                  </pic:blipFill>
+                  <pic:spPr>
+                    <a:xfrm>
+                      <a:off x="0" y="0"/>
+                      <a:ext cx="5220000" cy="1213724"/>
+                    </a:xfrm>
+                    <a:prstGeom prst="rect"/>
+                  </pic:spPr>
+                </pic:pic>
+              </a:graphicData>
+            </a:graphic>
+          </wp:inline>
+        </w:drawing>
       </w:r>
     </w:p>
     <w:p>

</xml_diff>

<commit_message>
docs: rerun openssl workflow and enrich sections 6-7 with screenshots and explanations
Agent-Logs-Url: https://github.com/zjxyun/network/sessions/ac48edf6-e1c5-423b-9fdf-082e5b434dcc

Co-authored-by: zjxyun <153380537+zjxyun@users.noreply.github.com>
</commit_message>
<xml_diff>
--- a/实验4扩展--基于OpenSSL的PKI证书体系搭建与通信加密实现课程设计报告（重写版）.docx
+++ b/实验4扩展--基于OpenSSL的PKI证书体系搭建与通信加密实现课程设计报告（重写版）.docx
@@ -551,12 +551,6 @@
         <w:jc w:val="left"/>
       </w:pPr>
       <w:r>
-        <w:rPr>
-          <w:rFonts w:eastAsia="黑体"/>
-          <w:rFonts w:ascii="黑体" w:hAnsi="黑体"/>
-          <w:b/>
-          <w:sz w:val="28"/>
-        </w:rPr>
         <w:t>六、详细设计与核心实现步骤（命令 + 截图 + 解释）</w:t>
       </w:r>
     </w:p>
@@ -648,6 +642,45 @@
     </w:p>
     <w:p>
       <w:pPr>
+        <w:jc w:val="center"/>
+      </w:pPr>
+      <w:r>
+        <w:drawing>
+          <wp:inline xmlns:a="http://schemas.openxmlformats.org/drawingml/2006/main" xmlns:pic="http://schemas.openxmlformats.org/drawingml/2006/picture">
+            <wp:extent cx="5688000" cy="3125406"/>
+            <wp:docPr id="2" name="Picture 2"/>
+            <wp:cNvGraphicFramePr>
+              <a:graphicFrameLocks noChangeAspect="1"/>
+            </wp:cNvGraphicFramePr>
+            <a:graphic>
+              <a:graphicData uri="http://schemas.openxmlformats.org/drawingml/2006/picture">
+                <pic:pic>
+                  <pic:nvPicPr>
+                    <pic:cNvPr id="0" name="screenshot_01.png"/>
+                    <pic:cNvPicPr/>
+                  </pic:nvPicPr>
+                  <pic:blipFill>
+                    <a:blip r:embed="rId10"/>
+                    <a:stretch>
+                      <a:fillRect/>
+                    </a:stretch>
+                  </pic:blipFill>
+                  <pic:spPr>
+                    <a:xfrm>
+                      <a:off x="0" y="0"/>
+                      <a:ext cx="5688000" cy="3125406"/>
+                    </a:xfrm>
+                    <a:prstGeom prst="rect"/>
+                  </pic:spPr>
+                </pic:pic>
+              </a:graphicData>
+            </a:graphic>
+          </wp:inline>
+        </w:drawing>
+      </w:r>
+    </w:p>
+    <w:p>
+      <w:pPr>
         <w:ind w:left="283"/>
       </w:pPr>
       <w:r>
@@ -726,6 +759,45 @@
     </w:p>
     <w:p>
       <w:pPr>
+        <w:jc w:val="center"/>
+      </w:pPr>
+      <w:r>
+        <w:drawing>
+          <wp:inline xmlns:a="http://schemas.openxmlformats.org/drawingml/2006/main" xmlns:pic="http://schemas.openxmlformats.org/drawingml/2006/picture">
+            <wp:extent cx="5688000" cy="1197474"/>
+            <wp:docPr id="3" name="Picture 3"/>
+            <wp:cNvGraphicFramePr>
+              <a:graphicFrameLocks noChangeAspect="1"/>
+            </wp:cNvGraphicFramePr>
+            <a:graphic>
+              <a:graphicData uri="http://schemas.openxmlformats.org/drawingml/2006/picture">
+                <pic:pic>
+                  <pic:nvPicPr>
+                    <pic:cNvPr id="0" name="screenshot_02.png"/>
+                    <pic:cNvPicPr/>
+                  </pic:nvPicPr>
+                  <pic:blipFill>
+                    <a:blip r:embed="rId11"/>
+                    <a:stretch>
+                      <a:fillRect/>
+                    </a:stretch>
+                  </pic:blipFill>
+                  <pic:spPr>
+                    <a:xfrm>
+                      <a:off x="0" y="0"/>
+                      <a:ext cx="5688000" cy="1197474"/>
+                    </a:xfrm>
+                    <a:prstGeom prst="rect"/>
+                  </pic:spPr>
+                </pic:pic>
+              </a:graphicData>
+            </a:graphic>
+          </wp:inline>
+        </w:drawing>
+      </w:r>
+    </w:p>
+    <w:p>
+      <w:pPr>
         <w:ind w:left="283"/>
       </w:pPr>
       <w:r>
@@ -786,6 +858,45 @@
         <w:t>openssl req -new -x509 -days 3650 -key ca.key -out ca.crt</w:t>
         <w:br/>
         <w:t>openssl x509 -in ca.crt -noout -subject -issuer -dates</w:t>
+      </w:r>
+    </w:p>
+    <w:p>
+      <w:pPr>
+        <w:jc w:val="center"/>
+      </w:pPr>
+      <w:r>
+        <w:drawing>
+          <wp:inline xmlns:a="http://schemas.openxmlformats.org/drawingml/2006/main" xmlns:pic="http://schemas.openxmlformats.org/drawingml/2006/picture">
+            <wp:extent cx="5688000" cy="1490855"/>
+            <wp:docPr id="4" name="Picture 4"/>
+            <wp:cNvGraphicFramePr>
+              <a:graphicFrameLocks noChangeAspect="1"/>
+            </wp:cNvGraphicFramePr>
+            <a:graphic>
+              <a:graphicData uri="http://schemas.openxmlformats.org/drawingml/2006/picture">
+                <pic:pic>
+                  <pic:nvPicPr>
+                    <pic:cNvPr id="0" name="screenshot_03.png"/>
+                    <pic:cNvPicPr/>
+                  </pic:nvPicPr>
+                  <pic:blipFill>
+                    <a:blip r:embed="rId12"/>
+                    <a:stretch>
+                      <a:fillRect/>
+                    </a:stretch>
+                  </pic:blipFill>
+                  <pic:spPr>
+                    <a:xfrm>
+                      <a:off x="0" y="0"/>
+                      <a:ext cx="5688000" cy="1490855"/>
+                    </a:xfrm>
+                    <a:prstGeom prst="rect"/>
+                  </pic:spPr>
+                </pic:pic>
+              </a:graphicData>
+            </a:graphic>
+          </wp:inline>
+        </w:drawing>
       </w:r>
     </w:p>
     <w:p>
@@ -860,6 +971,45 @@
     </w:p>
     <w:p>
       <w:pPr>
+        <w:jc w:val="center"/>
+      </w:pPr>
+      <w:r>
+        <w:drawing>
+          <wp:inline xmlns:a="http://schemas.openxmlformats.org/drawingml/2006/main" xmlns:pic="http://schemas.openxmlformats.org/drawingml/2006/picture">
+            <wp:extent cx="5688000" cy="3754080"/>
+            <wp:docPr id="5" name="Picture 5"/>
+            <wp:cNvGraphicFramePr>
+              <a:graphicFrameLocks noChangeAspect="1"/>
+            </wp:cNvGraphicFramePr>
+            <a:graphic>
+              <a:graphicData uri="http://schemas.openxmlformats.org/drawingml/2006/picture">
+                <pic:pic>
+                  <pic:nvPicPr>
+                    <pic:cNvPr id="0" name="screenshot_04.png"/>
+                    <pic:cNvPicPr/>
+                  </pic:nvPicPr>
+                  <pic:blipFill>
+                    <a:blip r:embed="rId13"/>
+                    <a:stretch>
+                      <a:fillRect/>
+                    </a:stretch>
+                  </pic:blipFill>
+                  <pic:spPr>
+                    <a:xfrm>
+                      <a:off x="0" y="0"/>
+                      <a:ext cx="5688000" cy="3754080"/>
+                    </a:xfrm>
+                    <a:prstGeom prst="rect"/>
+                  </pic:spPr>
+                </pic:pic>
+              </a:graphicData>
+            </a:graphic>
+          </wp:inline>
+        </w:drawing>
+      </w:r>
+    </w:p>
+    <w:p>
+      <w:pPr>
         <w:ind w:left="283"/>
       </w:pPr>
       <w:r>
@@ -938,6 +1088,45 @@
     </w:p>
     <w:p>
       <w:pPr>
+        <w:jc w:val="center"/>
+      </w:pPr>
+      <w:r>
+        <w:drawing>
+          <wp:inline xmlns:a="http://schemas.openxmlformats.org/drawingml/2006/main" xmlns:pic="http://schemas.openxmlformats.org/drawingml/2006/picture">
+            <wp:extent cx="5688000" cy="1197474"/>
+            <wp:docPr id="6" name="Picture 6"/>
+            <wp:cNvGraphicFramePr>
+              <a:graphicFrameLocks noChangeAspect="1"/>
+            </wp:cNvGraphicFramePr>
+            <a:graphic>
+              <a:graphicData uri="http://schemas.openxmlformats.org/drawingml/2006/picture">
+                <pic:pic>
+                  <pic:nvPicPr>
+                    <pic:cNvPr id="0" name="screenshot_05.png"/>
+                    <pic:cNvPicPr/>
+                  </pic:nvPicPr>
+                  <pic:blipFill>
+                    <a:blip r:embed="rId14"/>
+                    <a:stretch>
+                      <a:fillRect/>
+                    </a:stretch>
+                  </pic:blipFill>
+                  <pic:spPr>
+                    <a:xfrm>
+                      <a:off x="0" y="0"/>
+                      <a:ext cx="5688000" cy="1197474"/>
+                    </a:xfrm>
+                    <a:prstGeom prst="rect"/>
+                  </pic:spPr>
+                </pic:pic>
+              </a:graphicData>
+            </a:graphic>
+          </wp:inline>
+        </w:drawing>
+      </w:r>
+    </w:p>
+    <w:p>
+      <w:pPr>
         <w:ind w:left="283"/>
       </w:pPr>
       <w:r>
@@ -998,6 +1187,45 @@
         <w:t>openssl req -new -key webmail.key -out webmail.csr</w:t>
         <w:br/>
         <w:t>openssl req -in webmail.csr -noout -text</w:t>
+      </w:r>
+    </w:p>
+    <w:p>
+      <w:pPr>
+        <w:jc w:val="center"/>
+      </w:pPr>
+      <w:r>
+        <w:drawing>
+          <wp:inline xmlns:a="http://schemas.openxmlformats.org/drawingml/2006/main" xmlns:pic="http://schemas.openxmlformats.org/drawingml/2006/picture">
+            <wp:extent cx="5688000" cy="6143040"/>
+            <wp:docPr id="7" name="Picture 7"/>
+            <wp:cNvGraphicFramePr>
+              <a:graphicFrameLocks noChangeAspect="1"/>
+            </wp:cNvGraphicFramePr>
+            <a:graphic>
+              <a:graphicData uri="http://schemas.openxmlformats.org/drawingml/2006/picture">
+                <pic:pic>
+                  <pic:nvPicPr>
+                    <pic:cNvPr id="0" name="screenshot_06.png"/>
+                    <pic:cNvPicPr/>
+                  </pic:nvPicPr>
+                  <pic:blipFill>
+                    <a:blip r:embed="rId15"/>
+                    <a:stretch>
+                      <a:fillRect/>
+                    </a:stretch>
+                  </pic:blipFill>
+                  <pic:spPr>
+                    <a:xfrm>
+                      <a:off x="0" y="0"/>
+                      <a:ext cx="5688000" cy="6143040"/>
+                    </a:xfrm>
+                    <a:prstGeom prst="rect"/>
+                  </pic:spPr>
+                </pic:pic>
+              </a:graphicData>
+            </a:graphic>
+          </wp:inline>
+        </w:drawing>
       </w:r>
     </w:p>
     <w:p>
@@ -1072,6 +1300,45 @@
     </w:p>
     <w:p>
       <w:pPr>
+        <w:jc w:val="center"/>
+      </w:pPr>
+      <w:r>
+        <w:drawing>
+          <wp:inline xmlns:a="http://schemas.openxmlformats.org/drawingml/2006/main" xmlns:pic="http://schemas.openxmlformats.org/drawingml/2006/picture">
+            <wp:extent cx="5688000" cy="3628345"/>
+            <wp:docPr id="8" name="Picture 8"/>
+            <wp:cNvGraphicFramePr>
+              <a:graphicFrameLocks noChangeAspect="1"/>
+            </wp:cNvGraphicFramePr>
+            <a:graphic>
+              <a:graphicData uri="http://schemas.openxmlformats.org/drawingml/2006/picture">
+                <pic:pic>
+                  <pic:nvPicPr>
+                    <pic:cNvPr id="0" name="screenshot_07.png"/>
+                    <pic:cNvPicPr/>
+                  </pic:nvPicPr>
+                  <pic:blipFill>
+                    <a:blip r:embed="rId16"/>
+                    <a:stretch>
+                      <a:fillRect/>
+                    </a:stretch>
+                  </pic:blipFill>
+                  <pic:spPr>
+                    <a:xfrm>
+                      <a:off x="0" y="0"/>
+                      <a:ext cx="5688000" cy="3628345"/>
+                    </a:xfrm>
+                    <a:prstGeom prst="rect"/>
+                  </pic:spPr>
+                </pic:pic>
+              </a:graphicData>
+            </a:graphic>
+          </wp:inline>
+        </w:drawing>
+      </w:r>
+    </w:p>
+    <w:p>
+      <w:pPr>
         <w:ind w:left="283"/>
       </w:pPr>
       <w:r>
@@ -1134,6 +1401,45 @@
     </w:p>
     <w:p>
       <w:pPr>
+        <w:jc w:val="center"/>
+      </w:pPr>
+      <w:r>
+        <w:drawing>
+          <wp:inline xmlns:a="http://schemas.openxmlformats.org/drawingml/2006/main" xmlns:pic="http://schemas.openxmlformats.org/drawingml/2006/picture">
+            <wp:extent cx="5688000" cy="1197474"/>
+            <wp:docPr id="9" name="Picture 9"/>
+            <wp:cNvGraphicFramePr>
+              <a:graphicFrameLocks noChangeAspect="1"/>
+            </wp:cNvGraphicFramePr>
+            <a:graphic>
+              <a:graphicData uri="http://schemas.openxmlformats.org/drawingml/2006/picture">
+                <pic:pic>
+                  <pic:nvPicPr>
+                    <pic:cNvPr id="0" name="screenshot_08.png"/>
+                    <pic:cNvPicPr/>
+                  </pic:nvPicPr>
+                  <pic:blipFill>
+                    <a:blip r:embed="rId17"/>
+                    <a:stretch>
+                      <a:fillRect/>
+                    </a:stretch>
+                  </pic:blipFill>
+                  <pic:spPr>
+                    <a:xfrm>
+                      <a:off x="0" y="0"/>
+                      <a:ext cx="5688000" cy="1197474"/>
+                    </a:xfrm>
+                    <a:prstGeom prst="rect"/>
+                  </pic:spPr>
+                </pic:pic>
+              </a:graphicData>
+            </a:graphic>
+          </wp:inline>
+        </w:drawing>
+      </w:r>
+    </w:p>
+    <w:p>
+      <w:pPr>
         <w:ind w:left="283"/>
       </w:pPr>
       <w:r>
@@ -1212,6 +1518,45 @@
     </w:p>
     <w:p>
       <w:pPr>
+        <w:jc w:val="center"/>
+      </w:pPr>
+      <w:r>
+        <w:drawing>
+          <wp:inline xmlns:a="http://schemas.openxmlformats.org/drawingml/2006/main" xmlns:pic="http://schemas.openxmlformats.org/drawingml/2006/picture">
+            <wp:extent cx="5688000" cy="1197474"/>
+            <wp:docPr id="10" name="Picture 10"/>
+            <wp:cNvGraphicFramePr>
+              <a:graphicFrameLocks noChangeAspect="1"/>
+            </wp:cNvGraphicFramePr>
+            <a:graphic>
+              <a:graphicData uri="http://schemas.openxmlformats.org/drawingml/2006/picture">
+                <pic:pic>
+                  <pic:nvPicPr>
+                    <pic:cNvPr id="0" name="screenshot_09.png"/>
+                    <pic:cNvPicPr/>
+                  </pic:nvPicPr>
+                  <pic:blipFill>
+                    <a:blip r:embed="rId18"/>
+                    <a:stretch>
+                      <a:fillRect/>
+                    </a:stretch>
+                  </pic:blipFill>
+                  <pic:spPr>
+                    <a:xfrm>
+                      <a:off x="0" y="0"/>
+                      <a:ext cx="5688000" cy="1197474"/>
+                    </a:xfrm>
+                    <a:prstGeom prst="rect"/>
+                  </pic:spPr>
+                </pic:pic>
+              </a:graphicData>
+            </a:graphic>
+          </wp:inline>
+        </w:drawing>
+      </w:r>
+    </w:p>
+    <w:p>
+      <w:pPr>
         <w:ind w:left="283"/>
       </w:pPr>
       <w:r>
@@ -1274,6 +1619,45 @@
     </w:p>
     <w:p>
       <w:pPr>
+        <w:jc w:val="center"/>
+      </w:pPr>
+      <w:r>
+        <w:drawing>
+          <wp:inline xmlns:a="http://schemas.openxmlformats.org/drawingml/2006/main" xmlns:pic="http://schemas.openxmlformats.org/drawingml/2006/picture">
+            <wp:extent cx="5688000" cy="1197474"/>
+            <wp:docPr id="11" name="Picture 11"/>
+            <wp:cNvGraphicFramePr>
+              <a:graphicFrameLocks noChangeAspect="1"/>
+            </wp:cNvGraphicFramePr>
+            <a:graphic>
+              <a:graphicData uri="http://schemas.openxmlformats.org/drawingml/2006/picture">
+                <pic:pic>
+                  <pic:nvPicPr>
+                    <pic:cNvPr id="0" name="screenshot_10.png"/>
+                    <pic:cNvPicPr/>
+                  </pic:nvPicPr>
+                  <pic:blipFill>
+                    <a:blip r:embed="rId19"/>
+                    <a:stretch>
+                      <a:fillRect/>
+                    </a:stretch>
+                  </pic:blipFill>
+                  <pic:spPr>
+                    <a:xfrm>
+                      <a:off x="0" y="0"/>
+                      <a:ext cx="5688000" cy="1197474"/>
+                    </a:xfrm>
+                    <a:prstGeom prst="rect"/>
+                  </pic:spPr>
+                </pic:pic>
+              </a:graphicData>
+            </a:graphic>
+          </wp:inline>
+        </w:drawing>
+      </w:r>
+    </w:p>
+    <w:p>
+      <w:pPr>
         <w:ind w:left="283"/>
       </w:pPr>
       <w:r>
@@ -1334,6 +1718,45 @@
         <w:t>openssl x509 -noout -modulus -in webmail.crt | openssl md5</w:t>
         <w:br/>
         <w:t>openssl rsa  -noout -modulus -in webmail.key | openssl md5</w:t>
+      </w:r>
+    </w:p>
+    <w:p>
+      <w:pPr>
+        <w:jc w:val="center"/>
+      </w:pPr>
+      <w:r>
+        <w:drawing>
+          <wp:inline xmlns:a="http://schemas.openxmlformats.org/drawingml/2006/main" xmlns:pic="http://schemas.openxmlformats.org/drawingml/2006/picture">
+            <wp:extent cx="5688000" cy="1239385"/>
+            <wp:docPr id="12" name="Picture 12"/>
+            <wp:cNvGraphicFramePr>
+              <a:graphicFrameLocks noChangeAspect="1"/>
+            </wp:cNvGraphicFramePr>
+            <a:graphic>
+              <a:graphicData uri="http://schemas.openxmlformats.org/drawingml/2006/picture">
+                <pic:pic>
+                  <pic:nvPicPr>
+                    <pic:cNvPr id="0" name="screenshot_11.png"/>
+                    <pic:cNvPicPr/>
+                  </pic:nvPicPr>
+                  <pic:blipFill>
+                    <a:blip r:embed="rId20"/>
+                    <a:stretch>
+                      <a:fillRect/>
+                    </a:stretch>
+                  </pic:blipFill>
+                  <pic:spPr>
+                    <a:xfrm>
+                      <a:off x="0" y="0"/>
+                      <a:ext cx="5688000" cy="1239385"/>
+                    </a:xfrm>
+                    <a:prstGeom prst="rect"/>
+                  </pic:spPr>
+                </pic:pic>
+              </a:graphicData>
+            </a:graphic>
+          </wp:inline>
+        </w:drawing>
       </w:r>
     </w:p>
     <w:p>
@@ -1421,6 +1844,45 @@
     </w:p>
     <w:p>
       <w:pPr>
+        <w:jc w:val="center"/>
+      </w:pPr>
+      <w:r>
+        <w:drawing>
+          <wp:inline xmlns:a="http://schemas.openxmlformats.org/drawingml/2006/main" xmlns:pic="http://schemas.openxmlformats.org/drawingml/2006/picture">
+            <wp:extent cx="5688000" cy="18716514"/>
+            <wp:docPr id="13" name="Picture 13"/>
+            <wp:cNvGraphicFramePr>
+              <a:graphicFrameLocks noChangeAspect="1"/>
+            </wp:cNvGraphicFramePr>
+            <a:graphic>
+              <a:graphicData uri="http://schemas.openxmlformats.org/drawingml/2006/picture">
+                <pic:pic>
+                  <pic:nvPicPr>
+                    <pic:cNvPr id="0" name="screenshot_12.png"/>
+                    <pic:cNvPicPr/>
+                  </pic:nvPicPr>
+                  <pic:blipFill>
+                    <a:blip r:embed="rId21"/>
+                    <a:stretch>
+                      <a:fillRect/>
+                    </a:stretch>
+                  </pic:blipFill>
+                  <pic:spPr>
+                    <a:xfrm>
+                      <a:off x="0" y="0"/>
+                      <a:ext cx="5688000" cy="18716514"/>
+                    </a:xfrm>
+                    <a:prstGeom prst="rect"/>
+                  </pic:spPr>
+                </pic:pic>
+              </a:graphicData>
+            </a:graphic>
+          </wp:inline>
+        </w:drawing>
+      </w:r>
+    </w:p>
+    <w:p>
+      <w:pPr>
         <w:ind w:left="283"/>
       </w:pPr>
       <w:r>
@@ -1485,6 +1947,45 @@
     </w:p>
     <w:p>
       <w:pPr>
+        <w:jc w:val="center"/>
+      </w:pPr>
+      <w:r>
+        <w:drawing>
+          <wp:inline xmlns:a="http://schemas.openxmlformats.org/drawingml/2006/main" xmlns:pic="http://schemas.openxmlformats.org/drawingml/2006/picture">
+            <wp:extent cx="5688000" cy="1742324"/>
+            <wp:docPr id="14" name="Picture 14"/>
+            <wp:cNvGraphicFramePr>
+              <a:graphicFrameLocks noChangeAspect="1"/>
+            </wp:cNvGraphicFramePr>
+            <a:graphic>
+              <a:graphicData uri="http://schemas.openxmlformats.org/drawingml/2006/picture">
+                <pic:pic>
+                  <pic:nvPicPr>
+                    <pic:cNvPr id="0" name="screenshot_13.png"/>
+                    <pic:cNvPicPr/>
+                  </pic:nvPicPr>
+                  <pic:blipFill>
+                    <a:blip r:embed="rId22"/>
+                    <a:stretch>
+                      <a:fillRect/>
+                    </a:stretch>
+                  </pic:blipFill>
+                  <pic:spPr>
+                    <a:xfrm>
+                      <a:off x="0" y="0"/>
+                      <a:ext cx="5688000" cy="1742324"/>
+                    </a:xfrm>
+                    <a:prstGeom prst="rect"/>
+                  </pic:spPr>
+                </pic:pic>
+              </a:graphicData>
+            </a:graphic>
+          </wp:inline>
+        </w:drawing>
+      </w:r>
+    </w:p>
+    <w:p>
+      <w:pPr>
         <w:ind w:left="283"/>
       </w:pPr>
       <w:r>
@@ -1547,6 +2048,45 @@
     </w:p>
     <w:p>
       <w:pPr>
+        <w:jc w:val="center"/>
+      </w:pPr>
+      <w:r>
+        <w:drawing>
+          <wp:inline xmlns:a="http://schemas.openxmlformats.org/drawingml/2006/main" xmlns:pic="http://schemas.openxmlformats.org/drawingml/2006/picture">
+            <wp:extent cx="5688000" cy="4759958"/>
+            <wp:docPr id="15" name="Picture 15"/>
+            <wp:cNvGraphicFramePr>
+              <a:graphicFrameLocks noChangeAspect="1"/>
+            </wp:cNvGraphicFramePr>
+            <a:graphic>
+              <a:graphicData uri="http://schemas.openxmlformats.org/drawingml/2006/picture">
+                <pic:pic>
+                  <pic:nvPicPr>
+                    <pic:cNvPr id="0" name="screenshot_14.png"/>
+                    <pic:cNvPicPr/>
+                  </pic:nvPicPr>
+                  <pic:blipFill>
+                    <a:blip r:embed="rId23"/>
+                    <a:stretch>
+                      <a:fillRect/>
+                    </a:stretch>
+                  </pic:blipFill>
+                  <pic:spPr>
+                    <a:xfrm>
+                      <a:off x="0" y="0"/>
+                      <a:ext cx="5688000" cy="4759958"/>
+                    </a:xfrm>
+                    <a:prstGeom prst="rect"/>
+                  </pic:spPr>
+                </pic:pic>
+              </a:graphicData>
+            </a:graphic>
+          </wp:inline>
+        </w:drawing>
+      </w:r>
+    </w:p>
+    <w:p>
+      <w:pPr>
         <w:ind w:left="283"/>
       </w:pPr>
       <w:r>
@@ -1607,6 +2147,45 @@
         <w:t># 使用 Wireshark 分别抓取 80 端口（HTTP）与 443 端口（HTTPS）流量</w:t>
         <w:br/>
         <w:t># 或：在终端用 curl 分别访问后比对输出</w:t>
+      </w:r>
+    </w:p>
+    <w:p>
+      <w:pPr>
+        <w:jc w:val="center"/>
+      </w:pPr>
+      <w:r>
+        <w:drawing>
+          <wp:inline xmlns:a="http://schemas.openxmlformats.org/drawingml/2006/main" xmlns:pic="http://schemas.openxmlformats.org/drawingml/2006/picture">
+            <wp:extent cx="5688000" cy="1490855"/>
+            <wp:docPr id="16" name="Picture 16"/>
+            <wp:cNvGraphicFramePr>
+              <a:graphicFrameLocks noChangeAspect="1"/>
+            </wp:cNvGraphicFramePr>
+            <a:graphic>
+              <a:graphicData uri="http://schemas.openxmlformats.org/drawingml/2006/picture">
+                <pic:pic>
+                  <pic:nvPicPr>
+                    <pic:cNvPr id="0" name="screenshot_15.png"/>
+                    <pic:cNvPicPr/>
+                  </pic:nvPicPr>
+                  <pic:blipFill>
+                    <a:blip r:embed="rId24"/>
+                    <a:stretch>
+                      <a:fillRect/>
+                    </a:stretch>
+                  </pic:blipFill>
+                  <pic:spPr>
+                    <a:xfrm>
+                      <a:off x="0" y="0"/>
+                      <a:ext cx="5688000" cy="1490855"/>
+                    </a:xfrm>
+                    <a:prstGeom prst="rect"/>
+                  </pic:spPr>
+                </pic:pic>
+              </a:graphicData>
+            </a:graphic>
+          </wp:inline>
+        </w:drawing>
       </w:r>
     </w:p>
     <w:p>
@@ -1695,6 +2274,45 @@
     </w:p>
     <w:p>
       <w:pPr>
+        <w:jc w:val="center"/>
+      </w:pPr>
+      <w:r>
+        <w:drawing>
+          <wp:inline xmlns:a="http://schemas.openxmlformats.org/drawingml/2006/main" xmlns:pic="http://schemas.openxmlformats.org/drawingml/2006/picture">
+            <wp:extent cx="5688000" cy="1365120"/>
+            <wp:docPr id="17" name="Picture 17"/>
+            <wp:cNvGraphicFramePr>
+              <a:graphicFrameLocks noChangeAspect="1"/>
+            </wp:cNvGraphicFramePr>
+            <a:graphic>
+              <a:graphicData uri="http://schemas.openxmlformats.org/drawingml/2006/picture">
+                <pic:pic>
+                  <pic:nvPicPr>
+                    <pic:cNvPr id="0" name="screenshot_16.png"/>
+                    <pic:cNvPicPr/>
+                  </pic:nvPicPr>
+                  <pic:blipFill>
+                    <a:blip r:embed="rId25"/>
+                    <a:stretch>
+                      <a:fillRect/>
+                    </a:stretch>
+                  </pic:blipFill>
+                  <pic:spPr>
+                    <a:xfrm>
+                      <a:off x="0" y="0"/>
+                      <a:ext cx="5688000" cy="1365120"/>
+                    </a:xfrm>
+                    <a:prstGeom prst="rect"/>
+                  </pic:spPr>
+                </pic:pic>
+              </a:graphicData>
+            </a:graphic>
+          </wp:inline>
+        </w:drawing>
+      </w:r>
+    </w:p>
+    <w:p>
+      <w:pPr>
         <w:ind w:left="283"/>
       </w:pPr>
       <w:r>
@@ -1763,6 +2381,45 @@
     </w:p>
     <w:p>
       <w:pPr>
+        <w:jc w:val="center"/>
+      </w:pPr>
+      <w:r>
+        <w:drawing>
+          <wp:inline xmlns:a="http://schemas.openxmlformats.org/drawingml/2006/main" xmlns:pic="http://schemas.openxmlformats.org/drawingml/2006/picture">
+            <wp:extent cx="5688000" cy="1239385"/>
+            <wp:docPr id="18" name="Picture 18"/>
+            <wp:cNvGraphicFramePr>
+              <a:graphicFrameLocks noChangeAspect="1"/>
+            </wp:cNvGraphicFramePr>
+            <a:graphic>
+              <a:graphicData uri="http://schemas.openxmlformats.org/drawingml/2006/picture">
+                <pic:pic>
+                  <pic:nvPicPr>
+                    <pic:cNvPr id="0" name="screenshot_17.png"/>
+                    <pic:cNvPicPr/>
+                  </pic:nvPicPr>
+                  <pic:blipFill>
+                    <a:blip r:embed="rId26"/>
+                    <a:stretch>
+                      <a:fillRect/>
+                    </a:stretch>
+                  </pic:blipFill>
+                  <pic:spPr>
+                    <a:xfrm>
+                      <a:off x="0" y="0"/>
+                      <a:ext cx="5688000" cy="1239385"/>
+                    </a:xfrm>
+                    <a:prstGeom prst="rect"/>
+                  </pic:spPr>
+                </pic:pic>
+              </a:graphicData>
+            </a:graphic>
+          </wp:inline>
+        </w:drawing>
+      </w:r>
+    </w:p>
+    <w:p>
+      <w:pPr>
         <w:ind w:left="283"/>
       </w:pPr>
       <w:r>
@@ -1823,6 +2480,45 @@
         <w:t>openssl dgst -sha256 -sign webmail.key -out plain.sig plain.txt</w:t>
         <w:br/>
         <w:t>ls -lh plain.sig</w:t>
+      </w:r>
+    </w:p>
+    <w:p>
+      <w:pPr>
+        <w:jc w:val="center"/>
+      </w:pPr>
+      <w:r>
+        <w:drawing>
+          <wp:inline xmlns:a="http://schemas.openxmlformats.org/drawingml/2006/main" xmlns:pic="http://schemas.openxmlformats.org/drawingml/2006/picture">
+            <wp:extent cx="5688000" cy="1197474"/>
+            <wp:docPr id="19" name="Picture 19"/>
+            <wp:cNvGraphicFramePr>
+              <a:graphicFrameLocks noChangeAspect="1"/>
+            </wp:cNvGraphicFramePr>
+            <a:graphic>
+              <a:graphicData uri="http://schemas.openxmlformats.org/drawingml/2006/picture">
+                <pic:pic>
+                  <pic:nvPicPr>
+                    <pic:cNvPr id="0" name="screenshot_18.png"/>
+                    <pic:cNvPicPr/>
+                  </pic:nvPicPr>
+                  <pic:blipFill>
+                    <a:blip r:embed="rId27"/>
+                    <a:stretch>
+                      <a:fillRect/>
+                    </a:stretch>
+                  </pic:blipFill>
+                  <pic:spPr>
+                    <a:xfrm>
+                      <a:off x="0" y="0"/>
+                      <a:ext cx="5688000" cy="1197474"/>
+                    </a:xfrm>
+                    <a:prstGeom prst="rect"/>
+                  </pic:spPr>
+                </pic:pic>
+              </a:graphicData>
+            </a:graphic>
+          </wp:inline>
+        </w:drawing>
       </w:r>
     </w:p>
     <w:p>
@@ -1902,6 +2598,45 @@
     </w:p>
     <w:p>
       <w:pPr>
+        <w:jc w:val="center"/>
+      </w:pPr>
+      <w:r>
+        <w:drawing>
+          <wp:inline xmlns:a="http://schemas.openxmlformats.org/drawingml/2006/main" xmlns:pic="http://schemas.openxmlformats.org/drawingml/2006/picture">
+            <wp:extent cx="5688000" cy="1993794"/>
+            <wp:docPr id="20" name="Picture 20"/>
+            <wp:cNvGraphicFramePr>
+              <a:graphicFrameLocks noChangeAspect="1"/>
+            </wp:cNvGraphicFramePr>
+            <a:graphic>
+              <a:graphicData uri="http://schemas.openxmlformats.org/drawingml/2006/picture">
+                <pic:pic>
+                  <pic:nvPicPr>
+                    <pic:cNvPr id="0" name="screenshot_19.png"/>
+                    <pic:cNvPicPr/>
+                  </pic:nvPicPr>
+                  <pic:blipFill>
+                    <a:blip r:embed="rId28"/>
+                    <a:stretch>
+                      <a:fillRect/>
+                    </a:stretch>
+                  </pic:blipFill>
+                  <pic:spPr>
+                    <a:xfrm>
+                      <a:off x="0" y="0"/>
+                      <a:ext cx="5688000" cy="1993794"/>
+                    </a:xfrm>
+                    <a:prstGeom prst="rect"/>
+                  </pic:spPr>
+                </pic:pic>
+              </a:graphicData>
+            </a:graphic>
+          </wp:inline>
+        </w:drawing>
+      </w:r>
+    </w:p>
+    <w:p>
+      <w:pPr>
         <w:ind w:left="283"/>
       </w:pPr>
       <w:r>
@@ -1952,11 +2687,7 @@
     </w:p>
     <w:p>
       <w:r>
-        <w:rPr>
-          <w:b/>
-          <w:sz w:val="24"/>
-        </w:rPr>
-        <w:t>测试结果1：证书签发与链路验证成功</w:t>
+        <w:t>截图与现象说明（截图7、截图8、截图14）：证书签发阶段出现“Signature ok”“Data Base Updated”，随后 openssl verify 返回“webmail.crt: OK”；在 s_client 链路验证中末尾出现“Verify return code: 0 (ok)”，说明证书链完整且服务端证书被根CA正确信任。</w:t>
       </w:r>
     </w:p>
     <w:p>
@@ -1964,17 +2695,7 @@
         <w:ind w:left="283"/>
       </w:pPr>
       <w:r>
-        <w:rPr>
-          <w:b/>
-          <w:sz w:val="22"/>
-        </w:rPr>
-        <w:t>截图现象：</w:t>
-      </w:r>
-      <w:r>
-        <w:rPr>
-          <w:sz w:val="22"/>
-        </w:rPr>
-        <w:t>截图现象（参见截图7、截图8、截图14）：openssl ca 输出"Signature ok"与"Data Base Updated"完成签发；openssl verify 返回 webmail.crt: OK；openssl s_client 末尾显示 Verify return code: 0 (ok)。</w:t>
+        <w:t>截图与现象说明（截图12、截图13、截图15）：curl -vk 能完成 TLS 握手并返回页面，证书详情可见 Subject/Issuer/有效期等字段；对比网络现象可见 HTTP 请求正文可读，而 HTTPS 业务载荷以加密数据呈现，体现了传输层加密对机密性的保护。</w:t>
       </w:r>
     </w:p>
     <w:p>
@@ -1982,26 +2703,12 @@
         <w:ind w:left="283"/>
       </w:pPr>
       <w:r>
-        <w:rPr>
-          <w:b/>
-          <w:sz w:val="22"/>
-        </w:rPr>
-        <w:t>结果解释：</w:t>
-      </w:r>
-      <w:r>
-        <w:rPr>
-          <w:sz w:val="22"/>
-        </w:rPr>
-        <w:t>服务器证书、根CA证书和 TLS 链路之间的信任关系已完整建立，证书链验证正确。根CA私钥签名的有效性在多个工具中得到一致验证，说明实验 PKI 体系结构运作正常。</w:t>
+        <w:t>截图与现象说明（截图16、截图17）：使用证书公钥加密后得到 plain.enc，文件不可直接阅读；再用匹配私钥解密得到 plain.dec，diff 无差异输出，证明“公钥加密—私钥解密”链路正确。</w:t>
       </w:r>
     </w:p>
     <w:p>
       <w:r>
-        <w:rPr>
-          <w:b/>
-          <w:sz w:val="24"/>
-        </w:rPr>
-        <w:t>测试结果2：HTTPS 通信加密成功</w:t>
+        <w:t>截图与现象说明（截图18、截图19）：先对原文生成签名并验签“Verified OK”，随后对原文追加内容后再次验签返回“Verification Failure”，说明数字签名可有效识别数据篡改并保障完整性。</w:t>
       </w:r>
     </w:p>
     <w:p>

</xml_diff>